<commit_message>
Editorial: location -> Wisconsin (drop Appleton); re-baseline UCI 96.7 -> 98.8
- Credits/affiliation/schema.org now say "Wisconsin" not "Appleton" (canonical
  editorial mark; brand guide updated). The "G. Appleton" FAIR reference stays.
- UCI/Yeh example re-scored with the current (corrected) ingest tool: 96.7 -> 98.8
  (the prior score predated a fidelity-scoring fix; assumptions were undercounted).
  Example files + whitepaper updated; relational fixture unchanged at 97.4.
- Canonical whitepaper page + PDF/DOCX/TeX/XML regenerated from the updated source.
</commit_message>
<xml_diff>
--- a/research/open3dcp-whitepaper/Open3DCP_Whitepaper_v1.0.docx
+++ b/research/open3dcp-whitepaper/Open3DCP_Whitepaper_v1.0.docx
@@ -23,7 +23,7 @@
         <w:pStyle w:val="Author"/>
       </w:pPr>
       <w:r>
-        <w:t xml:space="preserve">Nicholas Sonnentag — Sunnyday Technologies, Appleton, WI, USA</w:t>
+        <w:t xml:space="preserve">Nicholas Sonnentag — Sunnyday Technologies, Wisconsin, USA</w:t>
       </w:r>
     </w:p>
     <w:p>
@@ -4079,7 +4079,7 @@
           <w:b/>
           <w:bCs/>
         </w:rPr>
-        <w:t xml:space="preserve">96.7/100 (A)</w:t>
+        <w:t xml:space="preserve">98.8/100 (A)</w:t>
       </w:r>
       <w:r>
         <w:t xml:space="preserve"> </w:t>

</xml_diff>

<commit_message>
Fig 1: widen boxes + trim sub-label font so labels no longer overrun the box edges
Regenerated PDF/DOCX/web canonical with the fixed data-chain figure.
</commit_message>
<xml_diff>
--- a/research/open3dcp-whitepaper/Open3DCP_Whitepaper_v1.0.docx
+++ b/research/open3dcp-whitepaper/Open3DCP_Whitepaper_v1.0.docx
@@ -2652,7 +2652,7 @@
       <w:r>
         <w:drawing>
           <wp:inline>
-            <wp:extent cx="5334000" cy="3075428"/>
+            <wp:extent cx="5334000" cy="2741688"/>
             <wp:effectExtent b="0" l="0" r="0" t="0"/>
             <wp:docPr descr="Open3DCP records the full ICME chain — composition, processing, structure/state, properties, and provenance — for one specimen in a single flat, analysis-ready row. The schema is the substrate for ICME-style process–structure–property analysis: it preserves the inputs and outcomes of a printed experiment without joins or file parsing." title="" id="16" name="Picture"/>
             <a:graphic>
@@ -2673,7 +2673,7 @@
                   <pic:spPr bwMode="auto">
                     <a:xfrm>
                       <a:off x="0" y="0"/>
-                      <a:ext cx="5334000" cy="3075428"/>
+                      <a:ext cx="5334000" cy="2741688"/>
                     </a:xfrm>
                     <a:prstGeom prst="rect">
                       <a:avLst/>

</xml_diff>

<commit_message>
Fig 6 honesty + contour_count synonyms + future-work note
- Fig 6 (crosswalk): the geometry/reinforcement/loading rows now read as PARTIAL
  (amber), not a red "dead-end collapse" — scalars, fibers and specimen geometry
  map; full relational structure goes to a side record; 3DCP reinforcement
  (bar/cable/mesh) and embedded sensors are named future-work gaps. Box padding
  loosened so labels breathe.
- contour_count: documented slicer synonyms (wall line count / wall layers /
  perimeters / shells) in schema, SCHEMA.md, and term justification; noted as
  distinct from num_layers.
- Whitepaper future-work: add the 3DCP reinforcement + embedded-sensor blocks.
</commit_message>
<xml_diff>
--- a/research/open3dcp-whitepaper/Open3DCP_Whitepaper_v1.0.docx
+++ b/research/open3dcp-whitepaper/Open3DCP_Whitepaper_v1.0.docx
@@ -5935,6 +5935,52 @@
       </w:r>
       <w:r>
         <w:t xml:space="preserve">keeping the flat-schema backward-compatibility guarantee.</w:t>
+      </w:r>
+    </w:p>
+    <w:p>
+      <w:pPr>
+        <w:pStyle w:val="Compact"/>
+        <w:numPr>
+          <w:ilvl w:val="0"/>
+          <w:numId w:val="1006"/>
+        </w:numPr>
+      </w:pPr>
+      <w:r>
+        <w:t xml:space="preserve">Add the</w:t>
+      </w:r>
+      <w:r>
+        <w:t xml:space="preserve"> </w:t>
+      </w:r>
+      <w:r>
+        <w:rPr>
+          <w:b/>
+          <w:bCs/>
+        </w:rPr>
+        <w:t xml:space="preserve">3DCP-native structural columns</w:t>
+      </w:r>
+      <w:r>
+        <w:t xml:space="preserve"> </w:t>
+      </w:r>
+      <w:r>
+        <w:t xml:space="preserve">the relational crosswalk surfaces as gaps rather than</w:t>
+      </w:r>
+      <w:r>
+        <w:t xml:space="preserve"> </w:t>
+      </w:r>
+      <w:r>
+        <w:t xml:space="preserve">dead ends: a reinforcement block beyond fibers (penetrating bar, entrained cable, inter-layer</w:t>
+      </w:r>
+      <w:r>
+        <w:t xml:space="preserve"> </w:t>
+      </w:r>
+      <w:r>
+        <w:t xml:space="preserve">mesh/textile) and embedded-sensor / in-situ print-monitoring references — additive and</w:t>
+      </w:r>
+      <w:r>
+        <w:t xml:space="preserve"> </w:t>
+      </w:r>
+      <w:r>
+        <w:t xml:space="preserve">backward-compatible.</w:t>
       </w:r>
     </w:p>
     <w:bookmarkEnd w:id="39"/>

</xml_diff>

<commit_message>
Fix mangled Fig 6 (drop overlapping in-figure caption) + remove speculative future-work
- Fig 6: the in-figure 3-line caption overlapped the annotation in the PDF and
  carried future-work speculation; removed it. The Markdown figure caption already
  explains the figure; the in-figure "PARTIAL" note stays.
- Whitepaper: removed the speculative future-work item (3DCP reinforcement /
  embedded sensors) — publish what's available today, not roadmap.
</commit_message>
<xml_diff>
--- a/research/open3dcp-whitepaper/Open3DCP_Whitepaper_v1.0.docx
+++ b/research/open3dcp-whitepaper/Open3DCP_Whitepaper_v1.0.docx
@@ -5935,52 +5935,6 @@
       </w:r>
       <w:r>
         <w:t xml:space="preserve">keeping the flat-schema backward-compatibility guarantee.</w:t>
-      </w:r>
-    </w:p>
-    <w:p>
-      <w:pPr>
-        <w:pStyle w:val="Compact"/>
-        <w:numPr>
-          <w:ilvl w:val="0"/>
-          <w:numId w:val="1006"/>
-        </w:numPr>
-      </w:pPr>
-      <w:r>
-        <w:t xml:space="preserve">Add the</w:t>
-      </w:r>
-      <w:r>
-        <w:t xml:space="preserve"> </w:t>
-      </w:r>
-      <w:r>
-        <w:rPr>
-          <w:b/>
-          <w:bCs/>
-        </w:rPr>
-        <w:t xml:space="preserve">3DCP-native structural columns</w:t>
-      </w:r>
-      <w:r>
-        <w:t xml:space="preserve"> </w:t>
-      </w:r>
-      <w:r>
-        <w:t xml:space="preserve">the relational crosswalk surfaces as gaps rather than</w:t>
-      </w:r>
-      <w:r>
-        <w:t xml:space="preserve"> </w:t>
-      </w:r>
-      <w:r>
-        <w:t xml:space="preserve">dead ends: a reinforcement block beyond fibers (penetrating bar, entrained cable, inter-layer</w:t>
-      </w:r>
-      <w:r>
-        <w:t xml:space="preserve"> </w:t>
-      </w:r>
-      <w:r>
-        <w:t xml:space="preserve">mesh/textile) and embedded-sensor / in-situ print-monitoring references — additive and</w:t>
-      </w:r>
-      <w:r>
-        <w:t xml:space="preserve"> </w:t>
-      </w:r>
-      <w:r>
-        <w:t xml:space="preserve">backward-compatible.</w:t>
       </w:r>
     </w:p>
     <w:bookmarkEnd w:id="39"/>

</xml_diff>

<commit_message>
Fig 6: restore the description in a clean caption band below the diagram (no overlap)
The description text the figure had was lost when the overlapping caption was
removed. Restored it as a full-width band beneath the diagram with dedicated
vertical space (figure made taller), so it can't collide with the boxes.
Factual only (no future-work speculation). PDF/DOCX/web rebuilt.
</commit_message>
<xml_diff>
--- a/research/open3dcp-whitepaper/Open3DCP_Whitepaper_v1.0.docx
+++ b/research/open3dcp-whitepaper/Open3DCP_Whitepaper_v1.0.docx
@@ -5408,7 +5408,7 @@
       <w:r>
         <w:drawing>
           <wp:inline>
-            <wp:extent cx="5334000" cy="3393094"/>
+            <wp:extent cx="5334000" cy="4147115"/>
             <wp:effectExtent b="0" l="0" r="0" t="0"/>
             <wp:docPr descr="Interoperability with a normalized relational concrete database. Material and test data map both ways by fidelity class (exact / lossy / categorical); the round-trip is not lossless — relational structure (geometry, reinforcement, devices, loading history) collapses to a side record, and the extrusion-3DCP block has no conventional relational counterpart." title="" id="35" name="Picture"/>
             <a:graphic>
@@ -5429,7 +5429,7 @@
                   <pic:spPr bwMode="auto">
                     <a:xfrm>
                       <a:off x="0" y="0"/>
-                      <a:ext cx="5334000" cy="3393094"/>
+                      <a:ext cx="5334000" cy="4147115"/>
                     </a:xfrm>
                     <a:prstGeom prst="rect">
                       <a:avLst/>

</xml_diff>

<commit_message>
Tidy + reconcile: rename UF example, harden extract scripts, 1.6.5 CHANGELOG, expand acknowledgments
- examples: rename ufutk-3dcp-mix -> uf-3dcp-mix; correct authorship to Gao/Wang/Wang
  (University of Florida) and drop the unsupported UTK/Tennessee attribution; UF/UTK -> UF throughout
- extract scripts (UNSW + UF): add header-fingerprint assertions so an upstream re-export that
  shifts columns fails loudly instead of silently emitting wrong data
- CHANGELOG: reconcile the 1.6 divergence with a 1.6.5 split -- [1.6.0] = SCM per-grade split
  (experimental, superseded), [1.6.5] = consolidation (removed the 8 grade columns),
  [1.7.0] = basis/uncertainty/raw-data/feature columns (correctly attributed + dated)
- whitepaper: fix §5.2 basis attribution (v1.6 -> v1.7); expand acknowledgments to NIST, ACI,
  ORNL and its MDF, and the ISO/ASTM 52939 committee + associated ASTM contributors (does not
  imply endorsement); rebuild PDF/DOCX/TeX/JATS-XML + canonical web page
</commit_message>
<xml_diff>
--- a/research/open3dcp-whitepaper/Open3DCP_Whitepaper_v1.0.docx
+++ b/research/open3dcp-whitepaper/Open3DCP_Whitepaper_v1.0.docx
@@ -1923,7 +1923,7 @@
         <w:t xml:space="preserve"> </w:t>
       </w:r>
       <w:r>
-        <w:t xml:space="preserve">basis; v1.6 made kg/m³ primary and added the bridge columns. Admixtures are recorded as</w:t>
+        <w:t xml:space="preserve">basis; v1.7 made kg/m³ primary and added the bridge columns. Admixtures are recorded as</w:t>
       </w:r>
       <w:r>
         <w:t xml:space="preserve"> </w:t>
@@ -4483,7 +4483,7 @@
           <w:b/>
           <w:bCs/>
         </w:rPr>
-        <w:t xml:space="preserve">UF/UTK 3D-Printing-Concrete Mix-Design</w:t>
+        <w:t xml:space="preserve">University of Florida 3D-Printing-Concrete Mix-Design</w:t>
       </w:r>
       <w:r>
         <w:t xml:space="preserve"> </w:t>
@@ -4768,7 +4768,7 @@
           <wp:inline>
             <wp:extent cx="5334000" cy="2198894"/>
             <wp:effectExtent b="0" l="0" r="0" t="0"/>
-            <wp:docPr descr="Worked demonstration. Left: six openly-licensed public datasets ingested into Open3DCP — UCI/Yeh (cast benchmark), Meta SustainableConcrete (cast, carbon-aware), UNSW UHPC, the RILEM TC 304-ADC interlaboratory study (real 3DCP, ~30 labs), the UF/UTK 3DCP mix-design set (printability), and the TU-Braunschweig 3DCP buildings catalogue (project layer) — each populating a different slice of the record (dark = populated, light = partial/absent), with Open3DCP spanning the union; the empty cells are recorded, not hidden. Three kg/m³ sources carry an automated open3dcp-ingest fidelity score (98.2–98.9 / A); the rest are curated through their native structure. Right: a cross-study characterization result from the RILEM data, expressible only because the schema records loading orientation — printed concrete loaded along the layers (X) is 32–55 % weaker than the cast reference, consistently across three independent laboratories (flexural strength, ~28 d; error bars are ± one standard deviation)." title="" id="28" name="Picture"/>
+            <wp:docPr descr="Worked demonstration. Left: six openly-licensed public datasets ingested into Open3DCP — UCI/Yeh (cast benchmark), Meta SustainableConcrete (cast, carbon-aware), UNSW UHPC, the RILEM TC 304-ADC interlaboratory study (real 3DCP, ~30 labs), the UF 3DCP mix-design set (printability), and the TU-Braunschweig 3DCP buildings catalogue (project layer) — each populating a different slice of the record (dark = populated, light = partial/absent), with Open3DCP spanning the union; the empty cells are recorded, not hidden. Three kg/m³ sources carry an automated open3dcp-ingest fidelity score (98.2–98.9 / A); the rest are curated through their native structure. Right: a cross-study characterization result from the RILEM data, expressible only because the schema records loading orientation — printed concrete loaded along the layers (X) is 32–55 % weaker than the cast reference, consistently across three independent laboratories (flexural strength, ~28 d; error bars are ± one standard deviation)." title="" id="28" name="Picture"/>
             <a:graphic>
               <a:graphicData uri="http://schemas.openxmlformats.org/drawingml/2006/picture">
                 <pic:pic>
@@ -4831,7 +4831,7 @@
         <w:t xml:space="preserve"> </w:t>
       </w:r>
       <w:r>
-        <w:t xml:space="preserve">six openly-licensed public datasets ingested into Open3DCP — UCI/Yeh (cast benchmark), Meta SustainableConcrete (cast, carbon-aware), UNSW UHPC, the RILEM TC 304-ADC interlaboratory study (real 3DCP, ~30 labs), the UF/UTK 3DCP mix-design set (printability), and the TU-Braunschweig 3DCP buildings catalogue (project layer) — each populating a different slice of the record (dark = populated, light = partial/absent), with Open3DCP spanning the union; the empty cells are recorded, not hidden. Three kg/m³ sources carry an automated</w:t>
+        <w:t xml:space="preserve">six openly-licensed public datasets ingested into Open3DCP — UCI/Yeh (cast benchmark), Meta SustainableConcrete (cast, carbon-aware), UNSW UHPC, the RILEM TC 304-ADC interlaboratory study (real 3DCP, ~30 labs), the UF 3DCP mix-design set (printability), and the TU-Braunschweig 3DCP buildings catalogue (project layer) — each populating a different slice of the record (dark = populated, light = partial/absent), with Open3DCP spanning the union; the empty cells are recorded, not hidden. Three kg/m³ sources carry an automated</w:t>
       </w:r>
       <w:r>
         <w:t xml:space="preserve"> </w:t>
@@ -6502,19 +6502,49 @@
         <w:t xml:space="preserve"> </w:t>
       </w:r>
       <w:r>
-        <w:t xml:space="preserve">The author thanks the RILEM TC 304-ADC committee for foundational work on 3DCP test</w:t>
-      </w:r>
-      <w:r>
-        <w:t xml:space="preserve"> </w:t>
-      </w:r>
-      <w:r>
-        <w:t xml:space="preserve">standardization and interlaboratory data sharing, and the broader 3DCP research community whose published</w:t>
-      </w:r>
-      <w:r>
-        <w:t xml:space="preserve"> </w:t>
-      </w:r>
-      <w:r>
-        <w:t xml:space="preserve">data motivated and informed the schema.</w:t>
+        <w:t xml:space="preserve">The author thanks the RILEM TC 304-ADC committee for foundational work on 3DCP</w:t>
+      </w:r>
+      <w:r>
+        <w:t xml:space="preserve"> </w:t>
+      </w:r>
+      <w:r>
+        <w:t xml:space="preserve">test standardization and interlaboratory data sharing; the National Institute of Standards and Technology</w:t>
+      </w:r>
+      <w:r>
+        <w:t xml:space="preserve"> </w:t>
+      </w:r>
+      <w:r>
+        <w:t xml:space="preserve">(NIST), the American Concrete Institute (ACI), Oak Ridge National Laboratory (ORNL) and its Manufacturing Demonstration Facility (MDF), and the</w:t>
+      </w:r>
+      <w:r>
+        <w:t xml:space="preserve"> </w:t>
+      </w:r>
+      <w:r>
+        <w:t xml:space="preserve">ISO/ASTM 52939 committee together with its associated ASTM contributors, for advancing the measurement</w:t>
+      </w:r>
+      <w:r>
+        <w:t xml:space="preserve"> </w:t>
+      </w:r>
+      <w:r>
+        <w:t xml:space="preserve">science, standards, and qualification frameworks on which additive construction depends; and the broader</w:t>
+      </w:r>
+      <w:r>
+        <w:t xml:space="preserve"> </w:t>
+      </w:r>
+      <w:r>
+        <w:t xml:space="preserve">3DCP research community whose published data motivated and informed the schema. Acknowledgment of these</w:t>
+      </w:r>
+      <w:r>
+        <w:t xml:space="preserve"> </w:t>
+      </w:r>
+      <w:r>
+        <w:t xml:space="preserve">organizations reflects the standards and measurement foundations the schema builds on and does not imply</w:t>
+      </w:r>
+      <w:r>
+        <w:t xml:space="preserve"> </w:t>
+      </w:r>
+      <w:r>
+        <w:t xml:space="preserve">their endorsement.</w:t>
       </w:r>
     </w:p>
     <w:bookmarkEnd w:id="41"/>

</xml_diff>